<commit_message>
feat: implement settings caching with background sync and standardize unit map sizing
</commit_message>
<xml_diff>
--- a/docs/iReside_QA_Test_Cases_Letter_Landscape.docx
+++ b/docs/iReside_QA_Test_Cases_Letter_Landscape.docx
@@ -4703,7 +4703,7 @@
                 <w:color w:val="000000"/>
                 <w:sz w:val="16"/>
               </w:rPr>
-              <w:t>Highlight only vacant rooms on the floor plan</w:t>
+              <w:t>Filter room availability using the bottom status dock</w:t>
             </w:r>
           </w:p>
         </w:tc>
@@ -4729,7 +4729,7 @@
                 <w:color w:val="000000"/>
                 <w:sz w:val="16"/>
               </w:rPr>
-              <w:t>Your building has both occupied and vacant rooms.</w:t>
+              <w:t>You have an active floor plan with both occupied and available rooms.</w:t>
             </w:r>
           </w:p>
         </w:tc>
@@ -4755,35 +4755,49 @@
                 <w:color w:val="000000"/>
                 <w:sz w:val="16"/>
               </w:rPr>
-              <w:t>1. Go to the Visual Unit Map.</w:t>
-            </w:r>
-          </w:p>
-          <w:p>
-            <w:pPr>
-              <w:spacing w:before="20" w:after="20" w:line="252" w:lineRule="auto"/>
-              <w:jc w:val="left"/>
-            </w:pPr>
-            <w:r>
-              <w:rPr>
-                <w:rFonts w:ascii="Times New Roman" w:hAnsi="Times New Roman"/>
-                <w:color w:val="000000"/>
-                <w:sz w:val="16"/>
-              </w:rPr>
-              <w:t>2. Click the "Vacant" filter button in the top toolbar.</w:t>
-            </w:r>
-          </w:p>
-          <w:p>
-            <w:pPr>
-              <w:spacing w:before="20" w:after="20" w:line="252" w:lineRule="auto"/>
-              <w:jc w:val="left"/>
-            </w:pPr>
-            <w:r>
-              <w:rPr>
-                <w:rFonts w:ascii="Times New Roman" w:hAnsi="Times New Roman"/>
-                <w:color w:val="000000"/>
-                <w:sz w:val="16"/>
-              </w:rPr>
-              <w:t>3. Look at the rooms on the floor plan.</w:t>
+              <w:t>1. Open the Visual Unit Map (`/landlord/unit-map`) and select your building.</w:t>
+            </w:r>
+          </w:p>
+          <w:p>
+            <w:pPr>
+              <w:spacing w:before="20" w:after="20" w:line="252" w:lineRule="auto"/>
+              <w:jc w:val="left"/>
+            </w:pPr>
+            <w:r>
+              <w:rPr>
+                <w:rFonts w:ascii="Times New Roman" w:hAnsi="Times New Roman"/>
+                <w:color w:val="000000"/>
+                <w:sz w:val="16"/>
+              </w:rPr>
+              <w:t>2. Locate the floating status filter bar at the bottom-left of the floor plan.</w:t>
+            </w:r>
+          </w:p>
+          <w:p>
+            <w:pPr>
+              <w:spacing w:before="20" w:after="20" w:line="252" w:lineRule="auto"/>
+              <w:jc w:val="left"/>
+            </w:pPr>
+            <w:r>
+              <w:rPr>
+                <w:rFonts w:ascii="Times New Roman" w:hAnsi="Times New Roman"/>
+                <w:color w:val="000000"/>
+                <w:sz w:val="16"/>
+              </w:rPr>
+              <w:t>3. Click the "Occupied" filter to turn it off (leaving "Available" active).</w:t>
+            </w:r>
+          </w:p>
+          <w:p>
+            <w:pPr>
+              <w:spacing w:before="20" w:after="20" w:line="252" w:lineRule="auto"/>
+              <w:jc w:val="left"/>
+            </w:pPr>
+            <w:r>
+              <w:rPr>
+                <w:rFonts w:ascii="Times New Roman" w:hAnsi="Times New Roman"/>
+                <w:color w:val="000000"/>
+                <w:sz w:val="16"/>
+              </w:rPr>
+              <w:t>4. Observe the rooms on the floor plan blueprint and the minimap.</w:t>
             </w:r>
           </w:p>
         </w:tc>
@@ -4809,7 +4823,7 @@
                 <w:color w:val="000000"/>
                 <w:sz w:val="16"/>
               </w:rPr>
-              <w:t>All vacant rooms light up in green, while occupied rooms are filtered out.</w:t>
+              <w:t>Occupied rooms dim and turn grey, while Available rooms stay clearly highlighted with green borders and indicators.</w:t>
             </w:r>
           </w:p>
         </w:tc>

</xml_diff>